<commit_message>
Use Case 2: call the unit a document, not a package
Text, tables, figure labels and key figures in the Use Case 2 report now say
document; the per-loan SharePoint package is a folder. Variable names unchanged.

Co-Authored-By: Claude Opus 5.5 <noreply@anthropic.com>
Claude-Session: https://claude.ai/code/session_019PF9w5va6U3p9NbQBxRQZc
</commit_message>
<xml_diff>
--- a/evals/roi/UseCase2_ROI.docx
+++ b/evals/roi/UseCase2_ROI.docx
@@ -40,7 +40,7 @@
         <w:keepNext w:val="false"/>
       </w:pPr>
       <w:r>
-        <w:t xml:space="preserve">Use Case 2 automates the rest of the package work around the wire instructions: collecting the request and its attachments, checking the settlement statement against the email and the wire, listing exceptions, and preparing the triage workbook, CashPro file and BCMP values. It builds on Use Case 1, which already reads the wire instructions.</w:t>
+        <w:t xml:space="preserve">Use Case 2 automates the rest of the work around the wire instructions: collecting the request and its attachments, checking the settlement statement against the email and the wire, listing exceptions, and preparing the triage workbook, CashPro file and BCMP values. It builds on Use Case 1, which already reads the wire instructions.</w:t>
       </w:r>
     </w:p>
     <w:p>
@@ -48,7 +48,7 @@
         <w:keepNext w:val="false"/>
       </w:pPr>
       <w:r>
-        <w:t xml:space="preserve">Once Use Case 1 is in place a package takes about 206 minutes of staff time. Use Case 2 is expected to bring that to about 61 minutes. At roughly 100 packages a month that frees a further 2,900 staff hours a year, the equivalent of 1.6 full-time positions, worth about $159k a year after running costs of about $600. Use Case 2 is not built yet, so these figures are estimates to be confirmed in the pilot.</w:t>
+        <w:t xml:space="preserve">Once Use Case 1 is in place a document takes about 206 minutes of staff time. Use Case 2 is expected to bring that to about 61 minutes. At roughly 100 documents a month that frees a further 2,900 staff hours a year, the equivalent of 1.6 full-time positions, worth about $159k a year after running costs of about $600. Use Case 2 is not built yet, so these figures are estimates to be confirmed in the pilot.</w:t>
       </w:r>
     </w:p>
     <w:tbl>
@@ -107,7 +107,7 @@
                 <w:sz w:val="16"/>
                 <w:szCs w:val="16"/>
               </w:rPr>
-              <w:t xml:space="preserve">expected staff time per package, after Use Case 1</w:t>
+              <w:t xml:space="preserve">expected staff time per document, after Use Case 1</w:t>
             </w:r>
           </w:p>
         </w:tc>
@@ -189,7 +189,7 @@
                 <w:sz w:val="16"/>
                 <w:szCs w:val="16"/>
               </w:rPr>
-              <w:t xml:space="preserve">net value per year at 100 packages a month</w:t>
+              <w:t xml:space="preserve">net value per year at 100 documents a month</w:t>
             </w:r>
           </w:p>
         </w:tc>
@@ -230,7 +230,7 @@
                 <w:sz w:val="16"/>
                 <w:szCs w:val="16"/>
               </w:rPr>
-              <w:t xml:space="preserve">AI cost per package for the added steps</w:t>
+              <w:t xml:space="preserve">AI cost per document for the added steps</w:t>
             </w:r>
           </w:p>
         </w:tc>
@@ -259,7 +259,7 @@
         <w:spacing w:after="60"/>
       </w:pPr>
       <w:r>
-        <w:t xml:space="preserve">Request emails and attachments collected into a standard SharePoint package for each loan.</w:t>
+        <w:t xml:space="preserve">Request emails and attachments collected into a standard SharePoint folder for each loan.</w:t>
       </w:r>
     </w:p>
     <w:p>
@@ -331,7 +331,7 @@
           <w:sz w:val="19"/>
           <w:szCs w:val="19"/>
         </w:rPr>
-        <w:t xml:space="preserve">Staff time per package</w:t>
+        <w:t xml:space="preserve">Staff time per document</w:t>
       </w:r>
     </w:p>
     <w:p>
@@ -344,7 +344,7 @@
           <wp:inline distT="0" distB="0" distL="0" distR="0">
             <wp:extent cx="5762625" cy="876300"/>
             <wp:effectExtent t="0" r="0" b="0" l="0"/>
-            <wp:docPr id="1" name="Staff time per package" descr="Figure 1. Use Case 2 removes about 145 minutes from each package, 70% of the time left once Use Case 1 is running." title="Staff time per package"/>
+            <wp:docPr id="1" name="Staff time per document" descr="Figure 1. Use Case 2 removes about 145 minutes from each document, 70% of the time left once Use Case 1 is running." title="Staff time per document"/>
             <wp:cNvGraphicFramePr>
               <a:graphicFrameLocks xmlns:a="http://schemas.openxmlformats.org/drawingml/2006/main" noChangeAspect="1"/>
             </wp:cNvGraphicFramePr>
@@ -402,7 +402,7 @@
           <w:sz w:val="17"/>
           <w:szCs w:val="17"/>
         </w:rPr>
-        <w:t xml:space="preserve"> Use Case 2 removes about 145 minutes from each package, 70% of the time left once Use Case 1 is running.</w:t>
+        <w:t xml:space="preserve"> Use Case 2 removes about 145 minutes from each document, 70% of the time left once Use Case 1 is running.</w:t>
       </w:r>
     </w:p>
     <w:p>
@@ -419,7 +419,7 @@
           <w:sz w:val="19"/>
           <w:szCs w:val="19"/>
         </w:rPr>
-        <w:t xml:space="preserve">Minutes per package, by task</w:t>
+        <w:t xml:space="preserve">Minutes per document, by task</w:t>
       </w:r>
     </w:p>
     <w:p>
@@ -432,7 +432,7 @@
           <wp:inline distT="0" distB="0" distL="0" distR="0">
             <wp:extent cx="5762625" cy="1485900"/>
             <wp:effectExtent t="0" r="0" b="0" l="0"/>
-            <wp:docPr id="1" name="Minutes per package, by task" descr="Figure 2. The largest reduction is in cross-document checks. Exceptions keep the most manual time, because call-backs to verify masked or changed wire details stay with a person." title="Minutes per package, by task"/>
+            <wp:docPr id="1" name="Minutes per document, by task" descr="Figure 2. The largest reduction is in cross-document checks. Exceptions keep the most manual time, because call-backs to verify masked or changed wire details stay with a person." title="Minutes per document, by task"/>
             <wp:cNvGraphicFramePr>
               <a:graphicFrameLocks xmlns:a="http://schemas.openxmlformats.org/drawingml/2006/main" noChangeAspect="1"/>
             </wp:cNvGraphicFramePr>
@@ -1281,7 +1281,7 @@
                 <w:sz w:val="18"/>
                 <w:szCs w:val="18"/>
               </w:rPr>
-              <w:t xml:space="preserve">Packages</w:t>
+              <w:t xml:space="preserve">Documents</w:t>
             </w:r>
           </w:p>
         </w:tc>
@@ -1859,7 +1859,7 @@
           <wp:inline distT="0" distB="0" distL="0" distR="0">
             <wp:extent cx="5762625" cy="1485900"/>
             <wp:effectExtent t="0" r="0" b="0" l="0"/>
-            <wp:docPr id="1" name="Cumulative net value of Use Case 2 over two years" descr="Figure 3. Volume starts at about 100 packages a month and grows 3% a month. With no growth the two-year figure is about $318k. Build cost is not included." title="Cumulative net value of Use Case 2 over two years"/>
+            <wp:docPr id="1" name="Cumulative net value of Use Case 2 over two years" descr="Figure 3. Volume starts at about 100 documents a month and grows 3% a month. With no growth the two-year figure is about $318k. Build cost is not included." title="Cumulative net value of Use Case 2 over two years"/>
             <wp:cNvGraphicFramePr>
               <a:graphicFrameLocks xmlns:a="http://schemas.openxmlformats.org/drawingml/2006/main" noChangeAspect="1"/>
             </wp:cNvGraphicFramePr>
@@ -1917,7 +1917,7 @@
           <w:sz w:val="17"/>
           <w:szCs w:val="17"/>
         </w:rPr>
-        <w:t xml:space="preserve"> Volume starts at about 100 packages a month and grows 3% a month. With no growth the two-year figure is about $318k. Build cost is not included.</w:t>
+        <w:t xml:space="preserve"> Volume starts at about 100 documents a month and grows 3% a month. With no growth the two-year figure is about $318k. Build cost is not included.</w:t>
       </w:r>
     </w:p>
     <w:p>
@@ -1979,7 +1979,7 @@
                 <w:sz w:val="18"/>
                 <w:szCs w:val="18"/>
               </w:rPr>
-              <w:t xml:space="preserve">AI reading of the settlement statement and email, per package</w:t>
+              <w:t xml:space="preserve">AI reading of the settlement statement and email, per document</w:t>
             </w:r>
           </w:p>
         </w:tc>
@@ -2054,7 +2054,7 @@
                 <w:sz w:val="18"/>
                 <w:szCs w:val="18"/>
               </w:rPr>
-              <w:t xml:space="preserve">AI processing per year at 100 packages a month</w:t>
+              <w:t xml:space="preserve">AI processing per year at 100 documents a month</w:t>
             </w:r>
           </w:p>
         </w:tc>
@@ -2185,7 +2185,7 @@
           <w:sz w:val="18"/>
           <w:szCs w:val="18"/>
         </w:rPr>
-        <w:t xml:space="preserve">Priced at the same Azure rates as Use Case 1, assuming about 4 pages per package for the settlement statement and email. Use Case 2 runs on the Azure services Use Case 1 already pays for, so only the additional hosting is counted here.</w:t>
+        <w:t xml:space="preserve">Priced at the same Azure rates as Use Case 1, assuming about 4 pages per document for the settlement statement and email. Use Case 2 runs on the Azure services Use Case 1 already pays for, so only the additional hosting is counted here.</w:t>
       </w:r>
     </w:p>
     <w:p>
@@ -2221,7 +2221,7 @@
           <w:sz w:val="18"/>
           <w:szCs w:val="18"/>
         </w:rPr>
-        <w:t xml:space="preserve"> about four hours of staff time per package today, and about 100 loans a month (from the Treasury loan volume).</w:t>
+        <w:t xml:space="preserve"> about four hours of staff time per document today, and about 100 loans a month (from the Treasury loan volume).</w:t>
       </w:r>
     </w:p>
     <w:p>
@@ -2249,7 +2249,7 @@
           <w:sz w:val="18"/>
           <w:szCs w:val="18"/>
         </w:rPr>
-        <w:t xml:space="preserve"> how the four hours divide across tasks; the share of each task that remains with a person once it is automated (intake 10%, cross-document checks 25%, exceptions 60%, output files 15%); a loaded staff cost of $55 an hour; 3% monthly growth; AI pages per package and hosting cost.</w:t>
+        <w:t xml:space="preserve"> how the four hours divide across tasks; the share of each task that remains with a person once it is automated (intake 10%, cross-document checks 25%, exceptions 60%, output files 15%); a loaded staff cost of $55 an hour; 3% monthly growth; AI pages per document and hosting cost.</w:t>
       </w:r>
     </w:p>
     <w:p>

</xml_diff>